<commit_message>
G7 pregame: realistic deployment — Hutson keeps his minutes
Reframe the Dobson swap to reflect actual playoff deployment:
Hutson plays 22+ 5v5 min/g regardless of nominal pair label.
St-Louis double-shifts him onto every key situation; the listed
Carrier-Hutson D3 is paper, not real ice time.

The swap is therefore Dobson taking Xhekaj's 12-14 min directly,
nothing else changing. Result: +0.19 xG/g (vs the prior +0.07 that
included a phantom structural cost from Hutson "losing 7 min").
Net for MTL after Tampa's Goncalves promotion: +0.18 xG/g —
small but clearly positive instead of essentially-a-wash.

Co-Authored-By: Claude Opus 4.7 (1M context) <noreply@anthropic.com>
</commit_message>
<xml_diff>
--- a/examples/habs_round1_2026/game7_pregame_2026-05-03_EN.docx
+++ b/examples/habs_round1_2026/game7_pregame_2026-05-03_EN.docx
@@ -80,56 +80,67 @@
           <w:sz w:val="20"/>
           <w:szCs w:val="20"/>
         </w:rPr>
-        <w:t xml:space="preserve">Hedman out. Dobson maybe. Game 7 in the balance.</w:t>
-      </w:r>
-      <w:r>
-        <w:rPr>
-          <w:rFonts w:ascii="Arial" w:cs="Arial" w:eastAsia="Arial" w:hAnsi="Arial"/>
-          <w:color w:val="111111"/>
-          <w:sz w:val="20"/>
-          <w:szCs w:val="20"/>
-        </w:rPr>
-        <w:t xml:space="preserve"> On lineup math alone, the projected swing between the two teams vs Game 6 is </w:t>
-      </w:r>
-      <w:r>
-        <w:rPr>
-          <w:rFonts w:ascii="Arial" w:cs="Arial" w:eastAsia="Arial" w:hAnsi="Arial"/>
-          <w:b/>
-          <w:bCs/>
-          <w:color w:val="111111"/>
-          <w:sz w:val="20"/>
-          <w:szCs w:val="20"/>
-        </w:rPr>
-        <w:t xml:space="preserve">+0.07 expected goals per game at 5v5</w:t>
-      </w:r>
-      <w:r>
-        <w:rPr>
-          <w:rFonts w:ascii="Arial" w:cs="Arial" w:eastAsia="Arial" w:hAnsi="Arial"/>
-          <w:color w:val="111111"/>
-          <w:sz w:val="20"/>
-          <w:szCs w:val="20"/>
-        </w:rPr>
-        <w:t xml:space="preserve"> in MTL's favor. That's essentially nothing. If Dobson plays, he nominally upgrades the top pair (++0.26 xG/g in isolation), but Hutson drops to D3 and loses ~7 minutes of 5v5 — a structural cost the iso swap doesn't capture. Tampa is heading into its 7th straight game without their captain. </w:t>
-      </w:r>
-      <w:r>
-        <w:rPr>
-          <w:rFonts w:ascii="Arial" w:cs="Arial" w:eastAsia="Arial" w:hAnsi="Arial"/>
-          <w:b/>
-          <w:bCs/>
-          <w:color w:val="111111"/>
-          <w:sz w:val="20"/>
-          <w:szCs w:val="20"/>
-        </w:rPr>
-        <w:t xml:space="preserve">The mathematical conclusion: lineups don't decide this game.</w:t>
-      </w:r>
-      <w:r>
-        <w:rPr>
-          <w:rFonts w:ascii="Arial" w:cs="Arial" w:eastAsia="Arial" w:hAnsi="Arial"/>
-          <w:color w:val="111111"/>
-          <w:sz w:val="20"/>
-          <w:szCs w:val="20"/>
-        </w:rPr>
-        <w:t xml:space="preserve"> What decides Game 7 is finishing variance, which goalie steals it for his team, and whether MTL's top line finally beats Vasilevskiy at even strength after 6 games of zero.</w:t>
+        <w:t xml:space="preserve">Hedman out. Dobson maybe. If Dobson plays, MTL gains real ground on lineup math alone.</w:t>
+      </w:r>
+      <w:r>
+        <w:rPr>
+          <w:rFonts w:ascii="Arial" w:cs="Arial" w:eastAsia="Arial" w:hAnsi="Arial"/>
+          <w:color w:val="111111"/>
+          <w:sz w:val="20"/>
+          <w:szCs w:val="20"/>
+        </w:rPr>
+        <w:t xml:space="preserve"> The Dobson IN / Xhekaj OUT swap at the 6th-D slot (Dobson takes Xhekaj's 12-14 minutes; the rest of the lineup is unchanged — Hutson plays his 22+ minutes regardless of what the lineup card says) is worth </w:t>
+      </w:r>
+      <w:r>
+        <w:rPr>
+          <w:rFonts w:ascii="Arial" w:cs="Arial" w:eastAsia="Arial" w:hAnsi="Arial"/>
+          <w:b/>
+          <w:bCs/>
+          <w:color w:val="111111"/>
+          <w:sz w:val="20"/>
+          <w:szCs w:val="20"/>
+        </w:rPr>
+        <w:t xml:space="preserve">+0.19 xG/g</w:t>
+      </w:r>
+      <w:r>
+        <w:rPr>
+          <w:rFonts w:ascii="Arial" w:cs="Arial" w:eastAsia="Arial" w:hAnsi="Arial"/>
+          <w:color w:val="111111"/>
+          <w:sz w:val="20"/>
+          <w:szCs w:val="20"/>
+        </w:rPr>
+        <w:t xml:space="preserve"> in isolation. Net for MTL after Tampa's reshuffle (Goncalves promoted to L2): </w:t>
+      </w:r>
+      <w:r>
+        <w:rPr>
+          <w:rFonts w:ascii="Arial" w:cs="Arial" w:eastAsia="Arial" w:hAnsi="Arial"/>
+          <w:b/>
+          <w:bCs/>
+          <w:color w:val="111111"/>
+          <w:sz w:val="20"/>
+          <w:szCs w:val="20"/>
+        </w:rPr>
+        <w:t xml:space="preserve">+0.18 xG/g</w:t>
+      </w:r>
+      <w:r>
+        <w:rPr>
+          <w:rFonts w:ascii="Arial" w:cs="Arial" w:eastAsia="Arial" w:hAnsi="Arial"/>
+          <w:color w:val="111111"/>
+          <w:sz w:val="20"/>
+          <w:szCs w:val="20"/>
+        </w:rPr>
+        <w:t xml:space="preserve"> in MTL's favor. Small but clearly positive. Tampa is heading into its 7th straight game without their captain — a structural disadvantage that accumulates. </w:t>
+      </w:r>
+      <w:r>
+        <w:rPr>
+          <w:rFonts w:ascii="Arial" w:cs="Arial" w:eastAsia="Arial" w:hAnsi="Arial"/>
+          <w:b/>
+          <w:bCs/>
+          <w:color w:val="111111"/>
+          <w:sz w:val="20"/>
+          <w:szCs w:val="20"/>
+        </w:rPr>
+        <w:t xml:space="preserve">Lineups help MTL on paper. What still decides Game 7 is finishing variance, which goalie steals it, and whether MTL's top line finally beats Vasilevskiy at even strength after 6 games of zero.</w:t>
       </w:r>
     </w:p>
     <w:p>
@@ -217,76 +228,36 @@
           <w:sz w:val="20"/>
           <w:szCs w:val="20"/>
         </w:rPr>
-        <w:t xml:space="preserve">Dobson is uncertain — and even if he plays, the net effect isn't obvious.</w:t>
-      </w:r>
-      <w:r>
-        <w:rPr>
-          <w:rFonts w:ascii="Arial" w:cs="Arial" w:eastAsia="Arial" w:hAnsi="Arial"/>
-          <w:color w:val="111111"/>
-          <w:sz w:val="20"/>
-          <w:szCs w:val="20"/>
-        </w:rPr>
-        <w:t xml:space="preserve"> In isolation, the Dobson IN / Xhekaj OUT swap at the D1 slot is worth </w:t>
-      </w:r>
-      <w:r>
-        <w:rPr>
-          <w:rFonts w:ascii="Arial" w:cs="Arial" w:eastAsia="Arial" w:hAnsi="Arial"/>
-          <w:b/>
-          <w:bCs/>
-          <w:color w:val="111111"/>
-          <w:sz w:val="20"/>
-          <w:szCs w:val="20"/>
-        </w:rPr>
-        <w:t xml:space="preserve">+0.26 xG/g</w:t>
-      </w:r>
-      <w:r>
-        <w:rPr>
-          <w:rFonts w:ascii="Arial" w:cs="Arial" w:eastAsia="Arial" w:hAnsi="Arial"/>
-          <w:color w:val="111111"/>
-          <w:sz w:val="20"/>
-          <w:szCs w:val="20"/>
-        </w:rPr>
-        <w:t xml:space="preserve"> (80% CI on xGF [+0.01, +0.36]). But that assumes Dobson at full speed — he's been out 22 days post thumb surgery. And it forces Hutson to drop to D3, removing ~7 minutes of 5v5 from a player whose series iso net60 is </w:t>
-      </w:r>
-      <w:r>
-        <w:rPr>
-          <w:rFonts w:ascii="Arial" w:cs="Arial" w:eastAsia="Arial" w:hAnsi="Arial"/>
-          <w:b/>
-          <w:bCs/>
-          <w:color w:val="111111"/>
-          <w:sz w:val="20"/>
-          <w:szCs w:val="20"/>
-        </w:rPr>
-        <w:t xml:space="preserve">+0.19</w:t>
-      </w:r>
-      <w:r>
-        <w:rPr>
-          <w:rFonts w:ascii="Arial" w:cs="Arial" w:eastAsia="Arial" w:hAnsi="Arial"/>
-          <w:color w:val="111111"/>
-          <w:sz w:val="20"/>
-          <w:szCs w:val="20"/>
-        </w:rPr>
-        <w:t xml:space="preserve">. Net effect of the full reshuffle: </w:t>
-      </w:r>
-      <w:r>
-        <w:rPr>
-          <w:rFonts w:ascii="Arial" w:cs="Arial" w:eastAsia="Arial" w:hAnsi="Arial"/>
-          <w:b/>
-          <w:bCs/>
-          <w:color w:val="111111"/>
-          <w:sz w:val="20"/>
-          <w:szCs w:val="20"/>
-        </w:rPr>
-        <w:t xml:space="preserve">+0.07 xG/g</w:t>
-      </w:r>
-      <w:r>
-        <w:rPr>
-          <w:rFonts w:ascii="Arial" w:cs="Arial" w:eastAsia="Arial" w:hAnsi="Arial"/>
-          <w:color w:val="111111"/>
-          <w:sz w:val="20"/>
-          <w:szCs w:val="20"/>
-        </w:rPr>
-        <w:t xml:space="preserve">. Small upgrade on paper.</w:t>
+        <w:t xml:space="preserve">If Dobson plays, that's net added value.</w:t>
+      </w:r>
+      <w:r>
+        <w:rPr>
+          <w:rFonts w:ascii="Arial" w:cs="Arial" w:eastAsia="Arial" w:hAnsi="Arial"/>
+          <w:color w:val="111111"/>
+          <w:sz w:val="20"/>
+          <w:szCs w:val="20"/>
+        </w:rPr>
+        <w:t xml:space="preserve"> The 6th-D-slot swap (Dobson takes Xhekaj's 12-14 minutes; St-Louis keeps Hutson at his 22+ min regardless of what the lineup card says) is worth </w:t>
+      </w:r>
+      <w:r>
+        <w:rPr>
+          <w:rFonts w:ascii="Arial" w:cs="Arial" w:eastAsia="Arial" w:hAnsi="Arial"/>
+          <w:b/>
+          <w:bCs/>
+          <w:color w:val="111111"/>
+          <w:sz w:val="20"/>
+          <w:szCs w:val="20"/>
+        </w:rPr>
+        <w:t xml:space="preserve">+0.19 xG/g</w:t>
+      </w:r>
+      <w:r>
+        <w:rPr>
+          <w:rFonts w:ascii="Arial" w:cs="Arial" w:eastAsia="Arial" w:hAnsi="Arial"/>
+          <w:color w:val="111111"/>
+          <w:sz w:val="20"/>
+          <w:szCs w:val="20"/>
+        </w:rPr>
+        <w:t xml:space="preserve"> — 80% CI on xGF [+0.01, +0.27], on xGA [-0.19, +0.09]. Caveat: Dobson hasn't played in 22 days (thumb surgery). A 30-50% rust haircut would be reasonable. His 25-26 reg-season was a tough iso year (on-ice xGF 63.8 vs xGA 71.9 over 1404 min) — not a heroic return, but a clear upgrade on the outgoing 6th D.</w:t>
       </w:r>
     </w:p>
     <w:p>
@@ -2739,7 +2710,7 @@
           <w:sz w:val="24"/>
           <w:szCs w:val="24"/>
         </w:rPr>
-        <w:t xml:space="preserve">Pivot 1 — Dobson IN, Xhekaj OUT, Hutson down to D3</w:t>
+        <w:t xml:space="preserve">Pivot 1 — Dobson IN, Xhekaj OUT at the 6th-D slot</w:t>
       </w:r>
     </w:p>
     <w:p>
@@ -2753,27 +2724,27 @@
           <w:sz w:val="20"/>
           <w:szCs w:val="20"/>
         </w:rPr>
-        <w:t xml:space="preserve">The mechanical D1-slot swap: Dobson (~19 min) replaces Xhekaj (~12 min). In pure iso, </w:t>
-      </w:r>
-      <w:r>
-        <w:rPr>
-          <w:rFonts w:ascii="Arial" w:cs="Arial" w:eastAsia="Arial" w:hAnsi="Arial"/>
-          <w:b/>
-          <w:bCs/>
-          <w:color w:val="111111"/>
-          <w:sz w:val="20"/>
-          <w:szCs w:val="20"/>
-        </w:rPr>
-        <w:t xml:space="preserve">+0.26 xG/g</w:t>
-      </w:r>
-      <w:r>
-        <w:rPr>
-          <w:rFonts w:ascii="Arial" w:cs="Arial" w:eastAsia="Arial" w:hAnsi="Arial"/>
-          <w:color w:val="111111"/>
-          <w:sz w:val="20"/>
-          <w:szCs w:val="20"/>
-        </w:rPr>
-        <w:t xml:space="preserve">, 80% CI on xGF [+0.01, +0.36], on xGA [-0.26, +0.12]. CI reading: </w:t>
+        <w:t xml:space="preserve">The mechanical swap: Dobson takes Xhekaj's 12-14 minutes. Hutson keeps his 22+ minutes — St-Louis isn't going to start Game 7 by benching his most-deployed defenseman. The lineup card may say "Hutson on D3 with Carrier"; in practice, Hutson double-shifts everywhere it counts. Pure iso math: </w:t>
+      </w:r>
+      <w:r>
+        <w:rPr>
+          <w:rFonts w:ascii="Arial" w:cs="Arial" w:eastAsia="Arial" w:hAnsi="Arial"/>
+          <w:b/>
+          <w:bCs/>
+          <w:color w:val="111111"/>
+          <w:sz w:val="20"/>
+          <w:szCs w:val="20"/>
+        </w:rPr>
+        <w:t xml:space="preserve">+0.19 xG/g</w:t>
+      </w:r>
+      <w:r>
+        <w:rPr>
+          <w:rFonts w:ascii="Arial" w:cs="Arial" w:eastAsia="Arial" w:hAnsi="Arial"/>
+          <w:color w:val="111111"/>
+          <w:sz w:val="20"/>
+          <w:szCs w:val="20"/>
+        </w:rPr>
+        <w:t xml:space="preserve">, 80% CI on xGF [+0.01, +0.27], on xGA [-0.19, +0.09]. CI reading: </w:t>
       </w:r>
       <w:r>
         <w:rPr>
@@ -2793,7 +2764,7 @@
           <w:sz w:val="20"/>
           <w:szCs w:val="20"/>
         </w:rPr>
-        <w:t xml:space="preserve">. The xGA interval crosses zero, so the defensive effect could be nothing. The xGF side is solidly positive.</w:t>
+        <w:t xml:space="preserve">.</w:t>
       </w:r>
     </w:p>
     <w:p>
@@ -2809,36 +2780,36 @@
           <w:sz w:val="20"/>
           <w:szCs w:val="20"/>
         </w:rPr>
-        <w:t xml:space="preserve">Three caveats</w:t>
-      </w:r>
-      <w:r>
-        <w:rPr>
-          <w:rFonts w:ascii="Arial" w:cs="Arial" w:eastAsia="Arial" w:hAnsi="Arial"/>
-          <w:color w:val="111111"/>
-          <w:sz w:val="20"/>
-          <w:szCs w:val="20"/>
-        </w:rPr>
-        <w:t xml:space="preserve"> on this number: (a) Dobson hasn't played in 22 days; we're assuming full speed — a 30-50% haircut for rust would be reasonable. (b) The calc ignores the structural cost of Hutson dropping to D3 and losing 7 minutes of 5v5. With his series iso net60 of </w:t>
-      </w:r>
-      <w:r>
-        <w:rPr>
-          <w:rFonts w:ascii="Arial" w:cs="Arial" w:eastAsia="Arial" w:hAnsi="Arial"/>
-          <w:b/>
-          <w:bCs/>
-          <w:color w:val="111111"/>
-          <w:sz w:val="20"/>
-          <w:szCs w:val="20"/>
-        </w:rPr>
-        <w:t xml:space="preserve">+0.193</w:t>
-      </w:r>
-      <w:r>
-        <w:rPr>
-          <w:rFonts w:ascii="Arial" w:cs="Arial" w:eastAsia="Arial" w:hAnsi="Arial"/>
-          <w:color w:val="111111"/>
-          <w:sz w:val="20"/>
-          <w:szCs w:val="20"/>
-        </w:rPr>
-        <w:t xml:space="preserve">, that's ~0.02 xG/g coming out of the lineup. (c) Dobson's 25-26 reg-season was a tough iso year (on-ice xGF 63.8 vs xGA 71.9 over 1404 min) — his recent baseline doesn't promise a heroic return.</w:t>
+        <w:t xml:space="preserve">Two caveats</w:t>
+      </w:r>
+      <w:r>
+        <w:rPr>
+          <w:rFonts w:ascii="Arial" w:cs="Arial" w:eastAsia="Arial" w:hAnsi="Arial"/>
+          <w:color w:val="111111"/>
+          <w:sz w:val="20"/>
+          <w:szCs w:val="20"/>
+        </w:rPr>
+        <w:t xml:space="preserve">: (a) Dobson is back from 22 days off and thumb surgery — we're assuming full speed. A 30-50% rust haircut would be reasonable, which would bring the swap to </w:t>
+      </w:r>
+      <w:r>
+        <w:rPr>
+          <w:rFonts w:ascii="Arial" w:cs="Arial" w:eastAsia="Arial" w:hAnsi="Arial"/>
+          <w:b/>
+          <w:bCs/>
+          <w:color w:val="111111"/>
+          <w:sz w:val="20"/>
+          <w:szCs w:val="20"/>
+        </w:rPr>
+        <w:t xml:space="preserve">++0.12 to ++0.09 xG/g</w:t>
+      </w:r>
+      <w:r>
+        <w:rPr>
+          <w:rFonts w:ascii="Arial" w:cs="Arial" w:eastAsia="Arial" w:hAnsi="Arial"/>
+          <w:color w:val="111111"/>
+          <w:sz w:val="20"/>
+          <w:szCs w:val="20"/>
+        </w:rPr>
+        <w:t xml:space="preserve">. (b) His 25-26 reg-season was a tough iso year (on-ice xGF 63.8 vs xGA 71.9 over 1404 min) — he's better than Xhekaj even at 50% of his best, but don't expect a heroic return.</w:t>
       </w:r>
     </w:p>
     <w:p>
@@ -4470,7 +4441,7 @@
           <w:sz w:val="20"/>
           <w:szCs w:val="20"/>
         </w:rPr>
-        <w:t xml:space="preserve">The structural cost of Hutson moving to D3 isn't directly modeled by the swap — it's absorbed into the total reshuffle (+0.07 xG/g) via the pair averages.</w:t>
+        <w:t xml:space="preserve">St-Louis's lineup card lists Hutson at D3 with Carrier, but in practice Hutson plays 22+ 5v5 minutes regardless of nominal pair label — he double-shifts onto every key situation. The swap calc reflects that reality (Dobson takes Xhekaj's minutes; everything else holds).</w:t>
       </w:r>
     </w:p>
     <w:p>
@@ -4522,7 +4493,7 @@
         </w:rPr>
         <w:t xml:space="preserve">• </w:t>
       </w:r>
-      <w:hyperlink w:history="1" r:id="rIdvuhvirjle9typ6bguvn-j">
+      <w:hyperlink w:history="1" r:id="rIducxs9ewrom5xbbligukif">
         <w:r>
           <w:rPr>
             <w:rStyle w:val="Hyperlink"/>
@@ -4547,7 +4518,7 @@
         </w:rPr>
         <w:t xml:space="preserve">• </w:t>
       </w:r>
-      <w:hyperlink w:history="1" r:id="rIduq7dewn4ezpvt5rjrn3p5">
+      <w:hyperlink w:history="1" r:id="rIdeem_zdvkmxhmiq4tby8d9">
         <w:r>
           <w:rPr>
             <w:rStyle w:val="Hyperlink"/>
@@ -4572,7 +4543,7 @@
         </w:rPr>
         <w:t xml:space="preserve">• </w:t>
       </w:r>
-      <w:hyperlink w:history="1" r:id="rIdyvhur1sdc_erqpmuqixgp">
+      <w:hyperlink w:history="1" r:id="rId0gr7mqkvje88jzkfh_131">
         <w:r>
           <w:rPr>
             <w:rStyle w:val="Hyperlink"/>
@@ -4597,7 +4568,7 @@
         </w:rPr>
         <w:t xml:space="preserve">• </w:t>
       </w:r>
-      <w:hyperlink w:history="1" r:id="rIdrbkhuwgs8kghmoq53xhoz">
+      <w:hyperlink w:history="1" r:id="rIdgktj5kfeornikhprd5urz">
         <w:r>
           <w:rPr>
             <w:rStyle w:val="Hyperlink"/>
@@ -4622,7 +4593,7 @@
         </w:rPr>
         <w:t xml:space="preserve">• </w:t>
       </w:r>
-      <w:hyperlink w:history="1" r:id="rIdv9opyj2iwr0a5mjb5sqpf">
+      <w:hyperlink w:history="1" r:id="rIdncj4k1m9eyz3qa8hckbyt">
         <w:r>
           <w:rPr>
             <w:rStyle w:val="Hyperlink"/>

</xml_diff>